<commit_message>
Fix Arabic figure captions in Word report
</commit_message>
<xml_diff>
--- a/docs/report-ar.docx
+++ b/docs/report-ar.docx
@@ -714,7 +714,7 @@
           <w:sz w:val="20"/>
           <w:rtl/>
         </w:rPr>
-        <w:t>????? 1: ?????? ???? ???????? ?????? ??? ?????? ???? ??????? ??????? ????? ?????? ?????? ???? ??????? ????.</w:t>
+        <w:t>الشكل 1: مقارنة حالة التضارب؛ النسخة غير الآمنة تفقد تحديثات المخزون بينما النسخة الآمنة تنهي المخزون بدقة.</w:t>
       </w:r>
     </w:p>
     <w:p>
@@ -1110,7 +1110,7 @@
           <w:sz w:val="20"/>
           <w:rtl/>
         </w:rPr>
-        <w:t>????? 2: ?????? ????? ???????? ????? ??????? ???? ??? ???????? ?????? ?? 80 ??? 8.</w:t>
+        <w:t>الشكل 2: مقارنة إدارة الموارد؛ تحديد التوازي يخفض عدد العمليات النشطة من 80 إلى 8.</w:t>
       </w:r>
     </w:p>
     <w:p>
@@ -1581,7 +1581,7 @@
           <w:sz w:val="20"/>
           <w:rtl/>
         </w:rPr>
-        <w:t>????? 3: ?????? ????? ???????? ?? webhook? ??? ??????? ???????? ????? ?? 3516 ms ??? 27 ms? ????? ????? ????? ?????? ??????.</w:t>
+        <w:t>الشكل 3: مقارنة الدفع المتزامن مع webhook؛ زمن استجابة المستخدم ينخفض من 3516 ms إلى 27 ms، بينما يكتمل العمل الخلفي لاحقًا.</w:t>
       </w:r>
     </w:p>
     <w:p>
@@ -1969,7 +1969,7 @@
           <w:sz w:val="20"/>
           <w:rtl/>
         </w:rPr>
-        <w:t>????? 4: ???????? ??? ????? ????? ??? ???? 500 ??? ?? ??????? ??? 1201 ????? ???? ?????? ?? ????? ?????? ??????? ???????.</w:t>
+        <w:t>الشكل 4: المعالجة على دفعات تحتفظ بحد أقصى 500 سجل في الذاكرة بدل 1201 سجلًا دفعة واحدة، مع إثبات اكتمال الوظيفة الخلفية.</w:t>
       </w:r>
     </w:p>
     <w:p>
@@ -2306,7 +2306,7 @@
           <w:sz w:val="20"/>
           <w:rtl/>
         </w:rPr>
-        <w:t>????? 5: ????? ??????? ???????? ??? app1 ? app2 ??? Nginx.</w:t>
+        <w:t>الشكل 5: توزيع الطلبات بالتناوب بين app1 و app2 عبر Nginx.</w:t>
       </w:r>
     </w:p>
     <w:p>
@@ -2627,7 +2627,7 @@
           <w:sz w:val="20"/>
           <w:rtl/>
         </w:rPr>
-        <w:t>????? 6: ????? ??????? ????? ????????? 100 ?200 ????? ???????? ?? ???? ???? ???????? ???? ????? ????????.</w:t>
+        <w:t>الشكل 6: نتائج اختباري الضغط لسيناريوي 100 و200 عملية متزامنة، مع نجاح جميع العمليات وعدم فقدان البيانات.</w:t>
       </w:r>
     </w:p>
     <w:p>
@@ -2855,7 +2855,7 @@
           <w:sz w:val="20"/>
           <w:rtl/>
         </w:rPr>
-        <w:t>????? 7: ?????? ?????? ??? Grafana ????? ????????? ????? ??????? ?? ??????? ???? ????????? ???????? ??????? ???????? ????? ???? ???????.</w:t>
+        <w:t>الشكل 7: مراقبة الأداء عبر Grafana أثناء الاختبار، وتشمل الطلبات في الثانية وزمن الاستجابة واستهلاك المعالج والذاكرة وتأخر حلقة الأحداث.</w:t>
       </w:r>
     </w:p>
     <w:p>

</xml_diff>

<commit_message>
Update final Arabic report
</commit_message>
<xml_diff>
--- a/docs/report-ar.docx
+++ b/docs/report-ar.docx
@@ -704,12 +704,10 @@
     </w:p>
     <w:p>
       <w:pPr>
-        <w:jc w:val="right"/>
-        <w:bidi/>
-      </w:pPr>
-      <w:r>
-        <w:rPr>
-          <w:rFonts w:ascii="Arial" w:hAnsi="Arial" w:cs="Arial"/>
+        <w:bidi/>
+      </w:pPr>
+      <w:r>
+        <w:rPr>
           <w:i/>
           <w:sz w:val="20"/>
           <w:rtl/>
@@ -960,6 +958,7 @@
           <w:sz w:val="26"/>
           <w:rtl/>
         </w:rPr>
+        <w:lastRenderedPageBreak/>
         <w:t>طريقة الاختبار</w:t>
       </w:r>
     </w:p>
@@ -973,7 +972,6 @@
           <w:sz w:val="24"/>
           <w:rtl/>
         </w:rPr>
-        <w:lastRenderedPageBreak/>
         <w:t>• `/api/demo/resource/uncontrolled`</w:t>
       </w:r>
     </w:p>
@@ -1100,12 +1098,10 @@
     </w:p>
     <w:p>
       <w:pPr>
-        <w:jc w:val="right"/>
-        <w:bidi/>
-      </w:pPr>
-      <w:r>
-        <w:rPr>
-          <w:rFonts w:ascii="Arial" w:hAnsi="Arial" w:cs="Arial"/>
+        <w:bidi/>
+      </w:pPr>
+      <w:r>
+        <w:rPr>
           <w:i/>
           <w:sz w:val="20"/>
           <w:rtl/>
@@ -1195,6 +1191,7 @@
           <w:sz w:val="24"/>
           <w:rtl/>
         </w:rPr>
+        <w:lastRenderedPageBreak/>
         <w:t>• تنفيذ جميع الخطوات داخل الطلب نفسه بشكل متزامن.</w:t>
       </w:r>
     </w:p>
@@ -1436,7 +1433,6 @@
           <w:sz w:val="26"/>
           <w:rtl/>
         </w:rPr>
-        <w:lastRenderedPageBreak/>
         <w:t>النتيجة</w:t>
       </w:r>
     </w:p>
@@ -1571,12 +1567,10 @@
     </w:p>
     <w:p>
       <w:pPr>
-        <w:jc w:val="right"/>
-        <w:bidi/>
-      </w:pPr>
-      <w:r>
-        <w:rPr>
-          <w:rFonts w:ascii="Arial" w:hAnsi="Arial" w:cs="Arial"/>
+        <w:bidi/>
+      </w:pPr>
+      <w:r>
+        <w:rPr>
           <w:i/>
           <w:sz w:val="20"/>
           <w:rtl/>
@@ -1585,6 +1579,9 @@
       </w:r>
     </w:p>
     <w:p>
+      <w:pPr>
+        <w:jc w:val="right"/>
+      </w:pPr>
       <w:r>
         <w:rPr>
           <w:sz w:val="24"/>
@@ -1715,6 +1712,7 @@
           <w:sz w:val="24"/>
           <w:rtl/>
         </w:rPr>
+        <w:lastRenderedPageBreak/>
         <w:t>استخدمنا:</w:t>
       </w:r>
     </w:p>
@@ -1920,6 +1918,9 @@
         </w:drawing>
       </w:r>
       <w:r>
+        <w:rPr>
+          <w:noProof/>
+        </w:rPr>
         <w:drawing>
           <wp:inline distT="0" distB="0" distL="0" distR="0" wp14:anchorId="4F9E1612" wp14:editId="0B0CD32B">
             <wp:extent cx="1600200" cy="2169245"/>
@@ -1959,12 +1960,10 @@
     </w:p>
     <w:p>
       <w:pPr>
-        <w:jc w:val="right"/>
-        <w:bidi/>
-      </w:pPr>
-      <w:r>
-        <w:rPr>
-          <w:rFonts w:ascii="Arial" w:hAnsi="Arial" w:cs="Arial"/>
+        <w:bidi/>
+      </w:pPr>
+      <w:r>
+        <w:rPr>
           <w:i/>
           <w:sz w:val="20"/>
           <w:rtl/>
@@ -1998,6 +1997,7 @@
           <w:sz w:val="30"/>
           <w:rtl/>
         </w:rPr>
+        <w:lastRenderedPageBreak/>
         <w:t>٩. المتطلب الخامس: توزيع الأحمال</w:t>
       </w:r>
     </w:p>
@@ -2041,7 +2041,6 @@
           <w:sz w:val="26"/>
           <w:rtl/>
         </w:rPr>
-        <w:lastRenderedPageBreak/>
         <w:t>الحلول الممكنة</w:t>
       </w:r>
     </w:p>
@@ -2251,12 +2250,14 @@
           <w:sz w:val="26"/>
           <w:rtl/>
         </w:rPr>
-        <w:lastRenderedPageBreak/>
         <w:t>النتيجة</w:t>
       </w:r>
     </w:p>
     <w:p>
       <w:r>
+        <w:rPr>
+          <w:noProof/>
+        </w:rPr>
         <w:drawing>
           <wp:inline distT="0" distB="0" distL="0" distR="0" wp14:anchorId="0B49D6EB" wp14:editId="5459D6A3">
             <wp:extent cx="3020893" cy="5359400"/>
@@ -2296,12 +2297,10 @@
     </w:p>
     <w:p>
       <w:pPr>
-        <w:jc w:val="right"/>
-        <w:bidi/>
-      </w:pPr>
-      <w:r>
-        <w:rPr>
-          <w:rFonts w:ascii="Arial" w:hAnsi="Arial" w:cs="Arial"/>
+        <w:bidi/>
+      </w:pPr>
+      <w:r>
+        <w:rPr>
           <w:i/>
           <w:sz w:val="20"/>
           <w:rtl/>
@@ -2361,6 +2360,7 @@
           <w:sz w:val="24"/>
           <w:rtl/>
         </w:rPr>
+        <w:lastRenderedPageBreak/>
         <w:t>• المقارنة بين النسخة غير الصحيحة والنسخة الصحيحة لكل فكرة.</w:t>
       </w:r>
     </w:p>
@@ -2385,7 +2385,6 @@
           <w:sz w:val="24"/>
           <w:rtl/>
         </w:rPr>
-        <w:lastRenderedPageBreak/>
         <w:t>• بيانات قاعدة البيانات قبل وبعد الاختبار.</w:t>
       </w:r>
     </w:p>
@@ -2541,6 +2540,9 @@
     </w:p>
     <w:p>
       <w:r>
+        <w:rPr>
+          <w:noProof/>
+        </w:rPr>
         <w:drawing>
           <wp:inline distT="0" distB="0" distL="0" distR="0" wp14:anchorId="1B6BD2CA" wp14:editId="69F00F52">
             <wp:extent cx="3158270" cy="2604654"/>
@@ -2578,6 +2580,9 @@
         </w:drawing>
       </w:r>
       <w:r>
+        <w:rPr>
+          <w:noProof/>
+        </w:rPr>
         <w:drawing>
           <wp:inline distT="0" distB="0" distL="0" distR="0" wp14:anchorId="362D0E4B" wp14:editId="41D4829D">
             <wp:extent cx="3137666" cy="2486660"/>
@@ -2617,16 +2622,15 @@
     </w:p>
     <w:p>
       <w:pPr>
-        <w:jc w:val="right"/>
-        <w:bidi/>
-      </w:pPr>
-      <w:r>
-        <w:rPr>
-          <w:rFonts w:ascii="Arial" w:hAnsi="Arial" w:cs="Arial"/>
+        <w:bidi/>
+      </w:pPr>
+      <w:r>
+        <w:rPr>
           <w:i/>
           <w:sz w:val="20"/>
           <w:rtl/>
         </w:rPr>
+        <w:lastRenderedPageBreak/>
         <w:t>الشكل 6: نتائج اختباري الضغط لسيناريوي 100 و200 عملية متزامنة، مع نجاح جميع العمليات وعدم فقدان البيانات.</w:t>
       </w:r>
     </w:p>
@@ -2654,7 +2658,6 @@
           <w:sz w:val="30"/>
           <w:rtl/>
         </w:rPr>
-        <w:lastRenderedPageBreak/>
         <w:t>١٢. المراقبة و AOP</w:t>
       </w:r>
     </w:p>
@@ -2765,6 +2768,9 @@
         </w:rPr>
       </w:pPr>
       <w:r>
+        <w:rPr>
+          <w:noProof/>
+        </w:rPr>
         <w:drawing>
           <wp:inline distT="0" distB="0" distL="0" distR="0" wp14:anchorId="4C3D76AA" wp14:editId="6CFE4394">
             <wp:extent cx="3019101" cy="1482302"/>
@@ -2803,6 +2809,7 @@
       </w:r>
       <w:r>
         <w:rPr>
+          <w:noProof/>
           <w:sz w:val="24"/>
           <w:rtl/>
         </w:rPr>
@@ -2845,12 +2852,10 @@
     </w:p>
     <w:p>
       <w:pPr>
-        <w:jc w:val="right"/>
-        <w:bidi/>
-      </w:pPr>
-      <w:r>
-        <w:rPr>
-          <w:rFonts w:ascii="Arial" w:hAnsi="Arial" w:cs="Arial"/>
+        <w:bidi/>
+      </w:pPr>
+      <w:r>
+        <w:rPr>
           <w:i/>
           <w:sz w:val="20"/>
           <w:rtl/>
@@ -2858,18 +2863,6 @@
         <w:t>الشكل 7: مراقبة الأداء عبر Grafana أثناء الاختبار، وتشمل الطلبات في الثانية وزمن الاستجابة واستهلاك المعالج والذاكرة وتأخر حلقة الأحداث.</w:t>
       </w:r>
     </w:p>
-    <w:p>
-      <w:pPr>
-        <w:bidi/>
-      </w:pPr>
-      <w:r>
-        <w:rPr>
-          <w:sz w:val="24"/>
-          <w:rtl/>
-        </w:rPr>
-        <w:t>أما مراقبة نشاط القرص فقد تم توثيقها من خلال أداة **Resource Monitor** في نظام Windows أثناء تشغيل اختبارات الضغط، لأن نشاط القرص مقياس تابع لنظام التشغيل وليس للواجهة البرمجية نفسها.</w:t>
-      </w:r>
-    </w:p>
     <w:p/>
     <w:p>
       <w:pPr>
@@ -2882,35 +2875,52 @@
           <w:sz w:val="30"/>
           <w:rtl/>
         </w:rPr>
-        <w:t>١٤. تفسير النتائج الجيدة والسيئة</w:t>
-      </w:r>
-    </w:p>
-    <w:p/>
-    <w:p>
-      <w:pPr>
-        <w:bidi/>
-      </w:pPr>
-      <w:r>
-        <w:rPr>
-          <w:sz w:val="24"/>
-          <w:rtl/>
-        </w:rPr>
-        <w:t>تظهر النتائج السيئة عند غياب وسائل التحكم، مثل ضياع بعض تحديثات المخزون في حالة التضارب، أو ارتفاع عدد العمليات النشطة بشكل مفرط، أو زيادة زمن الاستجابة عند تنفيذ كل المهام داخل الطلب نفسه. في المقابل، تظهر النتائج الجيدة بعد تطبيق الأقفال والمعاملات والطوابير والمعالجة على دفعات، حيث تصبح البيانات صحيحة، ويصبح الضغط أكثر استقرارًا، وينخفض زمن الاستجابة للمستخدم.</w:t>
-      </w:r>
-    </w:p>
-    <w:p/>
-    <w:p>
-      <w:pPr>
-        <w:pStyle w:val="Heading2"/>
-        <w:bidi/>
-      </w:pPr>
+        <w:t>١٣</w:t>
+      </w:r>
       <w:r>
         <w:rPr>
           <w:rFonts w:ascii="Arial" w:hAnsi="Arial" w:cs="Arial"/>
           <w:sz w:val="30"/>
           <w:rtl/>
         </w:rPr>
-        <w:t>١٥. الخلاصة</w:t>
+        <w:t>. تفسير النتائج الجيدة والسيئة</w:t>
+      </w:r>
+    </w:p>
+    <w:p/>
+    <w:p>
+      <w:pPr>
+        <w:bidi/>
+      </w:pPr>
+      <w:r>
+        <w:rPr>
+          <w:sz w:val="24"/>
+          <w:rtl/>
+        </w:rPr>
+        <w:t>تظهر النتائج السيئة عند غياب وسائل التحكم، مثل ضياع بعض تحديثات المخزون في حالة التضارب، أو ارتفاع عدد العمليات النشطة بشكل مفرط، أو زيادة زمن الاستجابة عند تنفيذ كل المهام داخل الطلب نفسه. في المقابل، تظهر النتائج الجيدة بعد تطبيق الأقفال والمعاملات والطوابير والمعالجة على دفعات، حيث تصبح البيانات صحيحة، ويصبح الضغط أكثر استقرارًا، وينخفض زمن الاستجابة للمستخدم.</w:t>
+      </w:r>
+    </w:p>
+    <w:p/>
+    <w:p>
+      <w:pPr>
+        <w:pStyle w:val="Heading2"/>
+        <w:bidi/>
+      </w:pPr>
+      <w:r>
+        <w:rPr>
+          <w:rFonts w:ascii="Arial" w:hAnsi="Arial" w:cs="Arial"/>
+          <w:sz w:val="30"/>
+          <w:rtl/>
+        </w:rPr>
+        <w:lastRenderedPageBreak/>
+        <w:t>١٤</w:t>
+      </w:r>
+      <w:r>
+        <w:rPr>
+          <w:rFonts w:ascii="Arial" w:hAnsi="Arial" w:cs="Arial"/>
+          <w:sz w:val="30"/>
+          <w:rtl/>
+        </w:rPr>
+        <w:t>. الخلاصة</w:t>
       </w:r>
     </w:p>
     <w:p/>
@@ -3819,7 +3829,6 @@
   <w:style w:type="character" w:default="1" w:styleId="DefaultParagraphFont">
     <w:name w:val="Default Paragraph Font"/>
     <w:uiPriority w:val="1"/>
-    <w:semiHidden/>
     <w:unhideWhenUsed/>
   </w:style>
   <w:style w:type="table" w:default="1" w:styleId="TableNormal">

</xml_diff>